<commit_message>
Add QR codes to reference sections of 4 facilitator guides
- availability-bias (2 refs)
- cognitive-bias-diagnostic-reasoning (5 refs)
- palliative-home-death-concordance (6 refs)
- systems-thinking-health-workforce (2 refs)

Co-Authored-By: Claude Opus 4.6 <noreply@anthropic.com>
</commit_message>
<xml_diff>
--- a/output/education/2026-03-29_availability-bias/availability-bias_guide_facilitator.docx
+++ b/output/education/2026-03-29_availability-bias/availability-bias_guide_facilitator.docx
@@ -4162,6 +4162,166 @@
         </w:tc>
       </w:tr>
     </w:tbl>
+    <w:p>
+      <w:pPr>
+        <w:pStyle w:val="Heading1"/>
+      </w:pPr>
+      <w:r>
+        <w:t>QRコード付き参考文献</w:t>
+      </w:r>
+    </w:p>
+    <w:tbl>
+      <w:tblPr>
+        <w:tblW w:type="auto" w:w="0"/>
+        <w:jc w:val="center"/>
+        <w:tblLook w:firstColumn="1" w:firstRow="1" w:lastColumn="0" w:lastRow="0" w:noHBand="0" w:noVBand="1" w:val="04A0"/>
+      </w:tblPr>
+      <w:tblGrid>
+        <w:gridCol w:w="2160"/>
+        <w:gridCol w:w="2160"/>
+        <w:gridCol w:w="2160"/>
+        <w:gridCol w:w="2160"/>
+      </w:tblGrid>
+      <w:tr>
+        <w:tc>
+          <w:tcPr>
+            <w:tcW w:type="dxa" w:w="2160"/>
+          </w:tcPr>
+          <w:p>
+            <w:pPr>
+              <w:jc w:val="center"/>
+            </w:pPr>
+            <w:r>
+              <w:drawing>
+                <wp:inline xmlns:a="http://schemas.openxmlformats.org/drawingml/2006/main" xmlns:pic="http://schemas.openxmlformats.org/drawingml/2006/picture">
+                  <wp:extent cx="900000" cy="900000"/>
+                  <wp:docPr id="1" name="Picture 1"/>
+                  <wp:cNvGraphicFramePr>
+                    <a:graphicFrameLocks noChangeAspect="1"/>
+                  </wp:cNvGraphicFramePr>
+                  <a:graphic>
+                    <a:graphicData uri="http://schemas.openxmlformats.org/drawingml/2006/picture">
+                      <pic:pic>
+                        <pic:nvPicPr>
+                          <pic:cNvPr id="0" name="image.png"/>
+                          <pic:cNvPicPr/>
+                        </pic:nvPicPr>
+                        <pic:blipFill>
+                          <a:blip r:embed="rId9"/>
+                          <a:stretch>
+                            <a:fillRect/>
+                          </a:stretch>
+                        </pic:blipFill>
+                        <pic:spPr>
+                          <a:xfrm>
+                            <a:off x="0" y="0"/>
+                            <a:ext cx="900000" cy="900000"/>
+                          </a:xfrm>
+                          <a:prstGeom prst="rect"/>
+                        </pic:spPr>
+                      </pic:pic>
+                    </a:graphicData>
+                  </a:graphic>
+                </wp:inline>
+              </w:drawing>
+            </w:r>
+          </w:p>
+        </w:tc>
+        <w:tc>
+          <w:tcPr>
+            <w:tcW w:type="dxa" w:w="2160"/>
+          </w:tcPr>
+          <w:p>
+            <w:r>
+              <w:rPr>
+                <w:rFonts w:ascii="Calibri" w:hAnsi="Calibri"/>
+                <w:b/>
+                <w:sz w:val="16"/>
+              </w:rPr>
+              <w:t>Moura EC et al. (2026) — Availability Bias, BMJ Qual Saf</w:t>
+            </w:r>
+          </w:p>
+          <w:p>
+            <w:r>
+              <w:rPr>
+                <w:color w:val="444499"/>
+                <w:sz w:val="12"/>
+              </w:rPr>
+              <w:t>https://doi.org/10.1136/bmjqs-2025-019520</w:t>
+            </w:r>
+          </w:p>
+        </w:tc>
+        <w:tc>
+          <w:tcPr>
+            <w:tcW w:type="dxa" w:w="2160"/>
+          </w:tcPr>
+          <w:p>
+            <w:pPr>
+              <w:jc w:val="center"/>
+            </w:pPr>
+            <w:r>
+              <w:drawing>
+                <wp:inline xmlns:a="http://schemas.openxmlformats.org/drawingml/2006/main" xmlns:pic="http://schemas.openxmlformats.org/drawingml/2006/picture">
+                  <wp:extent cx="900000" cy="900000"/>
+                  <wp:docPr id="2" name="Picture 2"/>
+                  <wp:cNvGraphicFramePr>
+                    <a:graphicFrameLocks noChangeAspect="1"/>
+                  </wp:cNvGraphicFramePr>
+                  <a:graphic>
+                    <a:graphicData uri="http://schemas.openxmlformats.org/drawingml/2006/picture">
+                      <pic:pic>
+                        <pic:nvPicPr>
+                          <pic:cNvPr id="0" name="image.png"/>
+                          <pic:cNvPicPr/>
+                        </pic:nvPicPr>
+                        <pic:blipFill>
+                          <a:blip r:embed="rId10"/>
+                          <a:stretch>
+                            <a:fillRect/>
+                          </a:stretch>
+                        </pic:blipFill>
+                        <pic:spPr>
+                          <a:xfrm>
+                            <a:off x="0" y="0"/>
+                            <a:ext cx="900000" cy="900000"/>
+                          </a:xfrm>
+                          <a:prstGeom prst="rect"/>
+                        </pic:spPr>
+                      </pic:pic>
+                    </a:graphicData>
+                  </a:graphic>
+                </wp:inline>
+              </w:drawing>
+            </w:r>
+          </w:p>
+        </w:tc>
+        <w:tc>
+          <w:tcPr>
+            <w:tcW w:type="dxa" w:w="2160"/>
+          </w:tcPr>
+          <w:p>
+            <w:r>
+              <w:rPr>
+                <w:rFonts w:ascii="Calibri" w:hAnsi="Calibri"/>
+                <w:b/>
+                <w:sz w:val="16"/>
+              </w:rPr>
+              <w:t>AJM (2025) — Over-investigation &amp; cognitive bias</w:t>
+            </w:r>
+          </w:p>
+          <w:p>
+            <w:r>
+              <w:rPr>
+                <w:color w:val="444499"/>
+                <w:sz w:val="12"/>
+              </w:rPr>
+              <w:t>https://doi.org/10.1016/j.amjmed.2025.10.013</w:t>
+            </w:r>
+          </w:p>
+        </w:tc>
+      </w:tr>
+    </w:tbl>
+    <w:p/>
     <w:sectPr>
       <w:pgSz w:w="12240" w:h="15840"/>
       <w:pgMar w:top="1440" w:right="1800" w:bottom="1440" w:left="1800" w:header="720" w:footer="720" w:gutter="0"/>

</xml_diff>